<commit_message>
Update weekly timetable UI, add work division to report, and fix registration business logic
</commit_message>
<xml_diff>
--- a/QuanLyDaoTao-main/QuanLyDaoTao/Bao_Cao_Do_An.docx
+++ b/QuanLyDaoTao-main/QuanLyDaoTao/Bao_Cao_Do_An.docx
@@ -385,6 +385,216 @@
         <w:t>Nhóm áp dụng mô hình phát triển phần mềm Agile, chia nhỏ các phân hệ chức năng để thực hiện song song. Thành viên 1 phụ trách thiết kế Database và xây dựng APIs Backend. Thành viên 2 thiết kế giao diện HTML/CSS và viết Javascript xử lý bất đồng bộ (AJAX Fetch API). Sau đó, hai bên phối hợp ghép nối hệ thống và tiến hành kiểm thử hộp đen (Black-box testing).</w:t>
       </w:r>
     </w:p>
+    <w:p>
+      <w:pPr/>
+    </w:p>
+    <w:p>
+      <w:pPr/>
+      <w:r>
+        <w:t>Bảng phân công nhiệm vụ chi tiết giữa các thành viên:</w:t>
+      </w:r>
+    </w:p>
+    <w:tbl>
+      <w:tblPr>
+        <w:tblStyle w:val="LiBang"/>
+        <w:tblW w:type="auto" w:w="0"/>
+        <w:tblLook w:firstColumn="1" w:firstRow="1" w:lastColumn="0" w:lastRow="0" w:noHBand="0" w:noVBand="1" w:val="04A0"/>
+      </w:tblPr>
+      <w:tblGrid>
+        <w:gridCol w:w="1872"/>
+        <w:gridCol w:w="1872"/>
+        <w:gridCol w:w="1872"/>
+        <w:gridCol w:w="1872"/>
+        <w:gridCol w:w="1872"/>
+      </w:tblGrid>
+      <w:tr>
+        <w:tc>
+          <w:tcPr>
+            <w:tcW w:type="dxa" w:w="1872"/>
+          </w:tcPr>
+          <w:p>
+            <w:r>
+              <w:rPr>
+                <w:b/>
+              </w:rPr>
+              <w:t>STT</w:t>
+            </w:r>
+          </w:p>
+        </w:tc>
+        <w:tc>
+          <w:tcPr>
+            <w:tcW w:type="dxa" w:w="1872"/>
+          </w:tcPr>
+          <w:p>
+            <w:r>
+              <w:rPr>
+                <w:b/>
+              </w:rPr>
+              <w:t>Sinh viên thực hiện</w:t>
+            </w:r>
+          </w:p>
+        </w:tc>
+        <w:tc>
+          <w:tcPr>
+            <w:tcW w:type="dxa" w:w="1872"/>
+          </w:tcPr>
+          <w:p>
+            <w:r>
+              <w:rPr>
+                <w:b/>
+              </w:rPr>
+              <w:t>Vai trò chính</w:t>
+            </w:r>
+          </w:p>
+        </w:tc>
+        <w:tc>
+          <w:tcPr>
+            <w:tcW w:type="dxa" w:w="1872"/>
+          </w:tcPr>
+          <w:p>
+            <w:r>
+              <w:rPr>
+                <w:b/>
+              </w:rPr>
+              <w:t>Nhiệm vụ chi tiết</w:t>
+            </w:r>
+          </w:p>
+        </w:tc>
+        <w:tc>
+          <w:tcPr>
+            <w:tcW w:type="dxa" w:w="1872"/>
+          </w:tcPr>
+          <w:p>
+            <w:r>
+              <w:rPr>
+                <w:b/>
+              </w:rPr>
+              <w:t>Tỷ lệ đóng góp</w:t>
+            </w:r>
+          </w:p>
+        </w:tc>
+      </w:tr>
+      <w:tr>
+        <w:tc>
+          <w:tcPr>
+            <w:tcW w:type="dxa" w:w="1872"/>
+          </w:tcPr>
+          <w:p>
+            <w:r>
+              <w:t>1</w:t>
+            </w:r>
+          </w:p>
+        </w:tc>
+        <w:tc>
+          <w:tcPr>
+            <w:tcW w:type="dxa" w:w="1872"/>
+          </w:tcPr>
+          <w:p>
+            <w:r>
+              <w:t>Nguyễn Gia Bách</w:t>
+              <w:br/>
+              <w:t>(B23DCVT042)</w:t>
+            </w:r>
+          </w:p>
+        </w:tc>
+        <w:tc>
+          <w:tcPr>
+            <w:tcW w:type="dxa" w:w="1872"/>
+          </w:tcPr>
+          <w:p>
+            <w:r>
+              <w:t>Backend Developer</w:t>
+            </w:r>
+          </w:p>
+        </w:tc>
+        <w:tc>
+          <w:tcPr>
+            <w:tcW w:type="dxa" w:w="1872"/>
+          </w:tcPr>
+          <w:p>
+            <w:r>
+              <w:t>- Thiết kế cấu trúc cơ sở dữ liệu (MySQL).</w:t>
+              <w:br/>
+              <w:t>- Hiện thực lớp Entity, Repository và Service Layer (DangKyService, ThanhToanService).</w:t>
+              <w:br/>
+              <w:t>- Xây dựng hệ thống RESTful API.</w:t>
+              <w:br/>
+              <w:t>- Thiết lập các ràng buộc nghiệp vụ (validate số môn, tính học phí).</w:t>
+            </w:r>
+          </w:p>
+        </w:tc>
+        <w:tc>
+          <w:tcPr>
+            <w:tcW w:type="dxa" w:w="1872"/>
+          </w:tcPr>
+          <w:p>
+            <w:r>
+              <w:t>50%</w:t>
+            </w:r>
+          </w:p>
+        </w:tc>
+      </w:tr>
+      <w:tr>
+        <w:tc>
+          <w:tcPr>
+            <w:tcW w:type="dxa" w:w="1872"/>
+          </w:tcPr>
+          <w:p>
+            <w:r>
+              <w:t>2</w:t>
+            </w:r>
+          </w:p>
+        </w:tc>
+        <w:tc>
+          <w:tcPr>
+            <w:tcW w:type="dxa" w:w="1872"/>
+          </w:tcPr>
+          <w:p>
+            <w:r>
+              <w:t>Nguyễn Duy Phúc</w:t>
+              <w:br/>
+              <w:t>(B23DCVT341)</w:t>
+            </w:r>
+          </w:p>
+        </w:tc>
+        <w:tc>
+          <w:tcPr>
+            <w:tcW w:type="dxa" w:w="1872"/>
+          </w:tcPr>
+          <w:p>
+            <w:r>
+              <w:t>Frontend Developer</w:t>
+            </w:r>
+          </w:p>
+        </w:tc>
+        <w:tc>
+          <w:tcPr>
+            <w:tcW w:type="dxa" w:w="1872"/>
+          </w:tcPr>
+          <w:p>
+            <w:r>
+              <w:t>- Thiết kế giao diện Website đồng bộ (HTML/CSS) hỗ trợ responsive.</w:t>
+              <w:br/>
+              <w:t>- Viết JavaScript bắt sự kiện và gọi Fetch API kết nối Backend.</w:t>
+              <w:br/>
+              <w:t>- Cài đặt thư viện vẽ biểu đồ Chart.js trực quan hóa điểm.</w:t>
+              <w:br/>
+              <w:t>- Xử lý lưu session đăng nhập trên Client (localStorage).</w:t>
+            </w:r>
+          </w:p>
+        </w:tc>
+        <w:tc>
+          <w:tcPr>
+            <w:tcW w:type="dxa" w:w="1872"/>
+          </w:tcPr>
+          <w:p>
+            <w:r>
+              <w:t>50%</w:t>
+            </w:r>
+          </w:p>
+        </w:tc>
+      </w:tr>
+    </w:tbl>
     <w:p>
       <w:pPr>
         <w:spacing w:after="120" w:line="312" w:lineRule="auto"/>
@@ -1085,7 +1295,7 @@
         <w:jc w:val="both"/>
       </w:pPr>
       <w:r>
-        <w:t>Biểu đồ Use Case tổng quát bao gồm tác nhân Sinh viên kết nối tới các Use Case nhánh: Đăng nhập, Đăng ký môn học, Đóng học phí, Xem bảng điểm, Xem lịch học &amp; lịch thi, Đổi thông tin cá nhân.</w:t>
+        <w:t>Biểu đồ Use Case tổng quát bao gồm tác nhân Sinh viên kết nối tới các Use Case nhánh: Đăng nhập, Đăng ký môn học, Đóng học phí, Xem bảng điểm, Xem lịch học &amp; lịch thi, Đổi thông tin cá nhân, Đăng xuất.</w:t>
       </w:r>
     </w:p>
     <w:p>
@@ -1134,6 +1344,96 @@
       </w:pPr>
       <w:r>
         <w:t>Điều kiện sau khi thực hiện: Dữ liệu thời khóa biểu, lịch thi và công nợ học phí được cập nhật mới.</w:t>
+      </w:r>
+    </w:p>
+    <w:p>
+      <w:pPr/>
+    </w:p>
+    <w:p>
+      <w:pPr/>
+      <w:r>
+        <w:t>- Đặc tả Use Case Đăng xuất:</w:t>
+      </w:r>
+    </w:p>
+    <w:p>
+      <w:pPr>
+        <w:pStyle w:val="Duudong2"/>
+      </w:pPr>
+      <w:r>
+        <w:t>Tác nhân: Sinh viên.</w:t>
+      </w:r>
+    </w:p>
+    <w:p>
+      <w:pPr>
+        <w:pStyle w:val="Duudong2"/>
+      </w:pPr>
+      <w:r>
+        <w:t>Điều kiện tiên quyết: Sinh viên đã đăng nhập thành công vào hệ thống.</w:t>
+      </w:r>
+    </w:p>
+    <w:p>
+      <w:pPr>
+        <w:pStyle w:val="Duudong2"/>
+      </w:pPr>
+      <w:r>
+        <w:t>Luồng hoạt động: Sinh viên nhấn vào biểu tượng Avatar ở góc trên bên phải → Chọn "Đăng xuất" → Hệ thống xóa phiên đăng nhập khỏi bộ nhớ trình duyệt (localStorage) → Chuyển hướng người dùng về trang Đăng nhập (login.html).</w:t>
+      </w:r>
+    </w:p>
+    <w:p>
+      <w:pPr>
+        <w:pStyle w:val="Duudong2"/>
+      </w:pPr>
+      <w:r>
+        <w:t>Điều kiện sau khi thực hiện: Người dùng không thể truy cập các trang nội bộ của hệ thống nếu chưa đăng nhập lại.</w:t>
+      </w:r>
+    </w:p>
+    <w:p>
+      <w:pPr/>
+    </w:p>
+    <w:p>
+      <w:pPr/>
+      <w:r>
+        <w:t>- Đặc tả Use Case Hủy đăng ký học phần:</w:t>
+      </w:r>
+    </w:p>
+    <w:p>
+      <w:pPr>
+        <w:pStyle w:val="Duudong2"/>
+      </w:pPr>
+      <w:r>
+        <w:t>Tác nhân: Sinh viên.</w:t>
+      </w:r>
+    </w:p>
+    <w:p>
+      <w:pPr>
+        <w:pStyle w:val="Duudong2"/>
+      </w:pPr>
+      <w:r>
+        <w:t>Điều kiện tiên quyết: Sinh viên đã đăng nhập và đã đăng ký ít nhất một lớp học phần trước đó.</w:t>
+      </w:r>
+    </w:p>
+    <w:p>
+      <w:pPr>
+        <w:pStyle w:val="Duudong2"/>
+      </w:pPr>
+      <w:r>
+        <w:t>Luồng hoạt động: Sinh viên truy cập trang Đăng ký môn học → Bỏ tick các checkbox lớp học phần muốn hủy → Nhấn nút "Xác nhận đăng ký" → Hệ thống so sánh danh sách lớp mới với danh sách cũ trong Database → Xóa các bản ghi đăng ký của những lớp bị bỏ chọn → Tính lại tổng tín chỉ và cập nhật lại công nợ học phí → Trả về thông báo thành công.</w:t>
+      </w:r>
+    </w:p>
+    <w:p>
+      <w:pPr>
+        <w:pStyle w:val="Duudong2"/>
+      </w:pPr>
+      <w:r>
+        <w:t>Điều kiện sau khi thực hiện: Dữ liệu thời khóa biểu, lịch thi và công nợ học phí được cập nhật mới, phản ánh đúng danh sách lớp học phần hiện tại.</w:t>
+      </w:r>
+    </w:p>
+    <w:p>
+      <w:pPr>
+        <w:pStyle w:val="Duudong2"/>
+      </w:pPr>
+      <w:r>
+        <w:t>Ngoại lệ: Nếu tổng số môn học sau khi hủy nhỏ hơn 4, hệ thống sẽ từ chối và hiển thị thông báo lỗi "Bạn phải chọn tối thiểu 4 môn học!".</w:t>
       </w:r>
     </w:p>
     <w:p>
@@ -1470,7 +1770,112 @@
           </w:p>
         </w:tc>
       </w:tr>
+      <w:tr>
+        <w:tc>
+          <w:tcPr>
+            <w:tcW w:type="dxa" w:w="3120"/>
+          </w:tcPr>
+          <w:p>
+            <w:r>
+              <w:t>mon_hoc</w:t>
+            </w:r>
+          </w:p>
+        </w:tc>
+        <w:tc>
+          <w:tcPr>
+            <w:tcW w:type="dxa" w:w="3120"/>
+          </w:tcPr>
+          <w:p>
+            <w:r>
+              <w:t>ma_mon (PK), ten_mon, so_tin_chi</w:t>
+            </w:r>
+          </w:p>
+        </w:tc>
+        <w:tc>
+          <w:tcPr>
+            <w:tcW w:type="dxa" w:w="3120"/>
+          </w:tcPr>
+          <w:p>
+            <w:r>
+              <w:t>Lưu thông tin danh mục các môn học trong chương trình đào tạo</w:t>
+            </w:r>
+          </w:p>
+        </w:tc>
+      </w:tr>
+      <w:tr>
+        <w:tc>
+          <w:tcPr>
+            <w:tcW w:type="dxa" w:w="3120"/>
+          </w:tcPr>
+          <w:p>
+            <w:r>
+              <w:t>thoi_khoa_bieu</w:t>
+            </w:r>
+          </w:p>
+        </w:tc>
+        <w:tc>
+          <w:tcPr>
+            <w:tcW w:type="dxa" w:w="3120"/>
+          </w:tcPr>
+          <w:p>
+            <w:r>
+              <w:t>id (PK), ma_sv (FK), id_lop (FK), thu, tiet_bat_dau, so_tiet, thoi_gian_hoc</w:t>
+            </w:r>
+          </w:p>
+        </w:tc>
+        <w:tc>
+          <w:tcPr>
+            <w:tcW w:type="dxa" w:w="3120"/>
+          </w:tcPr>
+          <w:p>
+            <w:r>
+              <w:t>Lưu lịch học chi tiết theo ngày, tiết, phòng học của từng sinh viên</w:t>
+            </w:r>
+          </w:p>
+        </w:tc>
+      </w:tr>
+      <w:tr>
+        <w:tc>
+          <w:tcPr>
+            <w:tcW w:type="dxa" w:w="3120"/>
+          </w:tcPr>
+          <w:p>
+            <w:r>
+              <w:t>lich_thi</w:t>
+            </w:r>
+          </w:p>
+        </w:tc>
+        <w:tc>
+          <w:tcPr>
+            <w:tcW w:type="dxa" w:w="3120"/>
+          </w:tcPr>
+          <w:p>
+            <w:r>
+              <w:t>id (PK), ma_mon (FK), ngay_thi, ca_thi, phong_thi</w:t>
+            </w:r>
+          </w:p>
+        </w:tc>
+        <w:tc>
+          <w:tcPr>
+            <w:tcW w:type="dxa" w:w="3120"/>
+          </w:tcPr>
+          <w:p>
+            <w:r>
+              <w:t>Lưu lịch thi cuối kỳ của từng môn học</w:t>
+            </w:r>
+          </w:p>
+        </w:tc>
+      </w:tr>
     </w:tbl>
+    <w:p>
+      <w:pPr/>
+    </w:p>
+    <w:p>
+      <w:pPr/>
+      <w:r>
+        <w:t>Bảng lop_hoc_phan có quan hệ N-1 với bảng mon_hoc thông qua khóa ngoại ma_mon, cho phép nhiều lớp học phần cùng thuộc một môn học. Bảng thoi_khoa_bieu có quan hệ N-1 với bảng lop_hoc_phan thông qua khóa ngoại id_lop và liên kết với sinh viên qua ma_sv. Bảng lich_thi có quan hệ 1-1 với bảng mon_hoc thông qua khóa ngoại ma_mon.</w:t>
+      </w:r>
+    </w:p>
     <w:p>
       <w:pPr>
         <w:pStyle w:val="u2"/>
@@ -1839,6 +2244,376 @@
       </w:tr>
     </w:tbl>
     <w:p>
+      <w:pPr/>
+    </w:p>
+    <w:p>
+      <w:pPr/>
+      <w:r>
+        <w:t>Ngoài 4 API chính đã trình bày ở trên, hệ thống còn cung cấp thêm các API bổ sung sau:</w:t>
+      </w:r>
+    </w:p>
+    <w:tbl>
+      <w:tblPr>
+        <w:tblStyle w:val="LiBang"/>
+        <w:tblW w:type="auto" w:w="0"/>
+        <w:tblLook w:firstColumn="1" w:firstRow="1" w:lastColumn="0" w:lastRow="0" w:noHBand="0" w:noVBand="1" w:val="04A0"/>
+      </w:tblPr>
+      <w:tblGrid>
+        <w:gridCol w:w="2340"/>
+        <w:gridCol w:w="2340"/>
+        <w:gridCol w:w="2340"/>
+        <w:gridCol w:w="2340"/>
+      </w:tblGrid>
+      <w:tr>
+        <w:tc>
+          <w:tcPr>
+            <w:tcW w:type="dxa" w:w="2340"/>
+          </w:tcPr>
+          <w:p>
+            <w:r>
+              <w:rPr>
+                <w:b/>
+              </w:rPr>
+              <w:t>Phương thức</w:t>
+            </w:r>
+          </w:p>
+        </w:tc>
+        <w:tc>
+          <w:tcPr>
+            <w:tcW w:type="dxa" w:w="2340"/>
+          </w:tcPr>
+          <w:p>
+            <w:r>
+              <w:rPr>
+                <w:b/>
+              </w:rPr>
+              <w:t>URI Endpoint</w:t>
+            </w:r>
+          </w:p>
+        </w:tc>
+        <w:tc>
+          <w:tcPr>
+            <w:tcW w:type="dxa" w:w="2340"/>
+          </w:tcPr>
+          <w:p>
+            <w:r>
+              <w:rPr>
+                <w:b/>
+              </w:rPr>
+              <w:t>Request Body (JSON)</w:t>
+            </w:r>
+          </w:p>
+        </w:tc>
+        <w:tc>
+          <w:tcPr>
+            <w:tcW w:type="dxa" w:w="2340"/>
+          </w:tcPr>
+          <w:p>
+            <w:r>
+              <w:rPr>
+                <w:b/>
+              </w:rPr>
+              <w:t>Response mẫu (JSON)</w:t>
+            </w:r>
+          </w:p>
+        </w:tc>
+      </w:tr>
+      <w:tr>
+        <w:tc>
+          <w:tcPr>
+            <w:tcW w:type="dxa" w:w="2340"/>
+          </w:tcPr>
+          <w:p>
+            <w:r>
+              <w:t>POST</w:t>
+            </w:r>
+          </w:p>
+        </w:tc>
+        <w:tc>
+          <w:tcPr>
+            <w:tcW w:type="dxa" w:w="2340"/>
+          </w:tcPr>
+          <w:p>
+            <w:r>
+              <w:t>/api/sinhvien/login</w:t>
+            </w:r>
+          </w:p>
+        </w:tc>
+        <w:tc>
+          <w:tcPr>
+            <w:tcW w:type="dxa" w:w="2340"/>
+          </w:tcPr>
+          <w:p>
+            <w:r>
+              <w:t>{"username": "B23DCVT341", "password": "0987654321"}</w:t>
+            </w:r>
+          </w:p>
+        </w:tc>
+        <w:tc>
+          <w:tcPr>
+            <w:tcW w:type="dxa" w:w="2340"/>
+          </w:tcPr>
+          <w:p>
+            <w:r>
+              <w:t>"SUCCESS" hoặc "FAIL"</w:t>
+            </w:r>
+          </w:p>
+        </w:tc>
+      </w:tr>
+      <w:tr>
+        <w:tc>
+          <w:tcPr>
+            <w:tcW w:type="dxa" w:w="2340"/>
+          </w:tcPr>
+          <w:p>
+            <w:r>
+              <w:t>PUT</w:t>
+            </w:r>
+          </w:p>
+        </w:tc>
+        <w:tc>
+          <w:tcPr>
+            <w:tcW w:type="dxa" w:w="2340"/>
+          </w:tcPr>
+          <w:p>
+            <w:r>
+              <w:t>/api/sinhvien/change-password</w:t>
+            </w:r>
+          </w:p>
+        </w:tc>
+        <w:tc>
+          <w:tcPr>
+            <w:tcW w:type="dxa" w:w="2340"/>
+          </w:tcPr>
+          <w:p>
+            <w:r>
+              <w:t>{"maSV": "...", "oldPassword": "...", "newPassword": "..."}</w:t>
+            </w:r>
+          </w:p>
+        </w:tc>
+        <w:tc>
+          <w:tcPr>
+            <w:tcW w:type="dxa" w:w="2340"/>
+          </w:tcPr>
+          <w:p>
+            <w:r>
+              <w:t>"SUCCESS" hoặc "SAI_MAT_KHAU"</w:t>
+            </w:r>
+          </w:p>
+        </w:tc>
+      </w:tr>
+      <w:tr>
+        <w:tc>
+          <w:tcPr>
+            <w:tcW w:type="dxa" w:w="2340"/>
+          </w:tcPr>
+          <w:p>
+            <w:r>
+              <w:t>GET</w:t>
+            </w:r>
+          </w:p>
+        </w:tc>
+        <w:tc>
+          <w:tcPr>
+            <w:tcW w:type="dxa" w:w="2340"/>
+          </w:tcPr>
+          <w:p>
+            <w:r>
+              <w:t>/api/ket-qua/{maSV}</w:t>
+            </w:r>
+          </w:p>
+        </w:tc>
+        <w:tc>
+          <w:tcPr>
+            <w:tcW w:type="dxa" w:w="2340"/>
+          </w:tcPr>
+          <w:p>
+            <w:r>
+              <w:t>None</w:t>
+            </w:r>
+          </w:p>
+        </w:tc>
+        <w:tc>
+          <w:tcPr>
+            <w:tcW w:type="dxa" w:w="2340"/>
+          </w:tcPr>
+          <w:p>
+            <w:r>
+              <w:t>[{"maMon": "INT1234", "diemTK10": 8.5, "diemTK4": 3.5, "diemTKChu": "A"}]</w:t>
+            </w:r>
+          </w:p>
+        </w:tc>
+      </w:tr>
+      <w:tr>
+        <w:tc>
+          <w:tcPr>
+            <w:tcW w:type="dxa" w:w="2340"/>
+          </w:tcPr>
+          <w:p>
+            <w:r>
+              <w:t>GET</w:t>
+            </w:r>
+          </w:p>
+        </w:tc>
+        <w:tc>
+          <w:tcPr>
+            <w:tcW w:type="dxa" w:w="2340"/>
+          </w:tcPr>
+          <w:p>
+            <w:r>
+              <w:t>/api/thoi-khoa-bieu/{maSV}</w:t>
+            </w:r>
+          </w:p>
+        </w:tc>
+        <w:tc>
+          <w:tcPr>
+            <w:tcW w:type="dxa" w:w="2340"/>
+          </w:tcPr>
+          <w:p>
+            <w:r>
+              <w:t>None</w:t>
+            </w:r>
+          </w:p>
+        </w:tc>
+        <w:tc>
+          <w:tcPr>
+            <w:tcW w:type="dxa" w:w="2340"/>
+          </w:tcPr>
+          <w:p>
+            <w:r>
+              <w:t>[{"maMon": "INT1234", "tenMon": "CSDL", "thu": "Thứ 2", "tietBatDau": 1}]</w:t>
+            </w:r>
+          </w:p>
+        </w:tc>
+      </w:tr>
+      <w:tr>
+        <w:tc>
+          <w:tcPr>
+            <w:tcW w:type="dxa" w:w="2340"/>
+          </w:tcPr>
+          <w:p>
+            <w:r>
+              <w:t>GET</w:t>
+            </w:r>
+          </w:p>
+        </w:tc>
+        <w:tc>
+          <w:tcPr>
+            <w:tcW w:type="dxa" w:w="2340"/>
+          </w:tcPr>
+          <w:p>
+            <w:r>
+              <w:t>/api/lich-thi/{maSV}</w:t>
+            </w:r>
+          </w:p>
+        </w:tc>
+        <w:tc>
+          <w:tcPr>
+            <w:tcW w:type="dxa" w:w="2340"/>
+          </w:tcPr>
+          <w:p>
+            <w:r>
+              <w:t>None</w:t>
+            </w:r>
+          </w:p>
+        </w:tc>
+        <w:tc>
+          <w:tcPr>
+            <w:tcW w:type="dxa" w:w="2340"/>
+          </w:tcPr>
+          <w:p>
+            <w:r>
+              <w:t>[{"maMon": "INT1234", "tenMon": "CSDL", "ngayThi": "2025-01-15", "phongThi": "A2-301"}]</w:t>
+            </w:r>
+          </w:p>
+        </w:tc>
+      </w:tr>
+      <w:tr>
+        <w:tc>
+          <w:tcPr>
+            <w:tcW w:type="dxa" w:w="2340"/>
+          </w:tcPr>
+          <w:p>
+            <w:r>
+              <w:t>GET</w:t>
+            </w:r>
+          </w:p>
+        </w:tc>
+        <w:tc>
+          <w:tcPr>
+            <w:tcW w:type="dxa" w:w="2340"/>
+          </w:tcPr>
+          <w:p>
+            <w:r>
+              <w:t>/api/hoc-phi/{maSV}</w:t>
+            </w:r>
+          </w:p>
+        </w:tc>
+        <w:tc>
+          <w:tcPr>
+            <w:tcW w:type="dxa" w:w="2340"/>
+          </w:tcPr>
+          <w:p>
+            <w:r>
+              <w:t>None</w:t>
+            </w:r>
+          </w:p>
+        </w:tc>
+        <w:tc>
+          <w:tcPr>
+            <w:tcW w:type="dxa" w:w="2340"/>
+          </w:tcPr>
+          <w:p>
+            <w:r>
+              <w:t>{"hocKy": "HK1", "soTienPhaiNop": 5000000, "trangThai": "Chưa nộp"}</w:t>
+            </w:r>
+          </w:p>
+        </w:tc>
+      </w:tr>
+      <w:tr>
+        <w:tc>
+          <w:tcPr>
+            <w:tcW w:type="dxa" w:w="2340"/>
+          </w:tcPr>
+          <w:p>
+            <w:r>
+              <w:t>GET</w:t>
+            </w:r>
+          </w:p>
+        </w:tc>
+        <w:tc>
+          <w:tcPr>
+            <w:tcW w:type="dxa" w:w="2340"/>
+          </w:tcPr>
+          <w:p>
+            <w:r>
+              <w:t>/api/dang-ky/chi-tiet/{maSV}</w:t>
+            </w:r>
+          </w:p>
+        </w:tc>
+        <w:tc>
+          <w:tcPr>
+            <w:tcW w:type="dxa" w:w="2340"/>
+          </w:tcPr>
+          <w:p>
+            <w:r>
+              <w:t>None</w:t>
+            </w:r>
+          </w:p>
+        </w:tc>
+        <w:tc>
+          <w:tcPr>
+            <w:tcW w:type="dxa" w:w="2340"/>
+          </w:tcPr>
+          <w:p>
+            <w:r>
+              <w:t>[{"maMon": "INT1234", "tenMon": "CSDL", "soTinChi": 3, "thanhTien": 1500000}]</w:t>
+            </w:r>
+          </w:p>
+        </w:tc>
+      </w:tr>
+    </w:tbl>
+    <w:p>
       <w:pPr>
         <w:pStyle w:val="u2"/>
         <w:spacing w:before="240" w:after="80"/>
@@ -2065,6 +2840,33 @@
           <w:i/>
         </w:rPr>
         <w:t>Khi sinh viên bấm nút Xác nhận, danh sách ID lớp được gửi lên REST Controller. Controller gọi sang Đăng ký Service. Tại đây, Service thực hiện vòng lặp check điều kiện list.size() &lt; 4. Nếu nhỏ hơn 4, quăng ra ngoại lệ IllegalArgumentException. Nếu hợp lệ, tiến hành gọi repository để lưu vào Database. Sau đó thực hiện truy vấn tổng số tín chỉ của các lớp học phần này và nhân với đơn giá 500.000đ để cập nhật lại bảng công nợ học phí.</w:t>
+      </w:r>
+    </w:p>
+    <w:p>
+      <w:pPr/>
+    </w:p>
+    <w:p>
+      <w:pPr/>
+      <w:r>
+        <w:t>Hệ thống áp dụng mô hình phân lớp rõ ràng với hai lớp Service chính:</w:t>
+      </w:r>
+    </w:p>
+    <w:p>
+      <w:pPr/>
+    </w:p>
+    <w:p>
+      <w:pPr/>
+      <w:r>
+        <w:t>DangKyService: Chịu trách nhiệm xử lý toàn bộ nghiệp vụ đăng ký môn học. Khi sinh viên bấm nút Xác nhận, Controller tiếp nhận request và ủy quyền xử lý cho DangKyService. Tại đây, Service thực hiện: (1) Kiểm tra sinh viên tồn tại trong hệ thống; (2) Validate điều kiện tối thiểu 4 môn học (nếu không đạt, quăng ra ngoại lệ IllegalArgumentException); (3) So sánh danh sách lớp mới với danh sách cũ để xác định các môn cần thêm và các môn cần xóa; (4) Gọi Repository để lưu/xóa dữ liệu trong Database; (5) Tính lại tổng số tín chỉ và nhân với đơn giá 500.000 VNĐ/tín chỉ để cập nhật bảng công nợ học phí.</w:t>
+      </w:r>
+    </w:p>
+    <w:p>
+      <w:pPr/>
+    </w:p>
+    <w:p>
+      <w:pPr/>
+      <w:r>
+        <w:t>ThanhToanService: Chịu trách nhiệm xử lý nghiệp vụ đóng học phí ảo. Service nhận số tiền đóng, duyệt qua danh sách công nợ của sinh viên và trừ dần vào từng khoản nợ. Cập nhật trạng thái tương ứng ("Đã nộp", "Đã nộp một phần", hoặc "Chưa nộp").</w:t>
       </w:r>
     </w:p>
     <w:p>
@@ -2529,6 +3331,502 @@
       </w:tr>
     </w:tbl>
     <w:p>
+      <w:pPr/>
+    </w:p>
+    <w:p>
+      <w:pPr/>
+      <w:r>
+        <w:t>Ngoài các test case cơ bản ở trên, nhóm còn kiểm thử bổ sung các chức năng sau:</w:t>
+      </w:r>
+    </w:p>
+    <w:tbl>
+      <w:tblPr>
+        <w:tblStyle w:val="LiBang"/>
+        <w:tblW w:type="auto" w:w="0"/>
+        <w:tblLook w:firstColumn="1" w:firstRow="1" w:lastColumn="0" w:lastRow="0" w:noHBand="0" w:noVBand="1" w:val="04A0"/>
+      </w:tblPr>
+      <w:tblGrid>
+        <w:gridCol w:w="2340"/>
+        <w:gridCol w:w="2340"/>
+        <w:gridCol w:w="2340"/>
+        <w:gridCol w:w="2340"/>
+      </w:tblGrid>
+      <w:tr>
+        <w:tc>
+          <w:tcPr>
+            <w:tcW w:type="dxa" w:w="2340"/>
+          </w:tcPr>
+          <w:p>
+            <w:r>
+              <w:rPr>
+                <w:b/>
+              </w:rPr>
+              <w:t>Chức năng kiểm thử</w:t>
+            </w:r>
+          </w:p>
+        </w:tc>
+        <w:tc>
+          <w:tcPr>
+            <w:tcW w:type="dxa" w:w="2340"/>
+          </w:tcPr>
+          <w:p>
+            <w:r>
+              <w:rPr>
+                <w:b/>
+              </w:rPr>
+              <w:t>Dữ liệu đầu vào</w:t>
+            </w:r>
+          </w:p>
+        </w:tc>
+        <w:tc>
+          <w:tcPr>
+            <w:tcW w:type="dxa" w:w="2340"/>
+          </w:tcPr>
+          <w:p>
+            <w:r>
+              <w:rPr>
+                <w:b/>
+              </w:rPr>
+              <w:t>Kết quả mong đợi</w:t>
+            </w:r>
+          </w:p>
+        </w:tc>
+        <w:tc>
+          <w:tcPr>
+            <w:tcW w:type="dxa" w:w="2340"/>
+          </w:tcPr>
+          <w:p>
+            <w:r>
+              <w:rPr>
+                <w:b/>
+              </w:rPr>
+              <w:t>Trạng thái</w:t>
+            </w:r>
+          </w:p>
+        </w:tc>
+      </w:tr>
+      <w:tr>
+        <w:tc>
+          <w:tcPr>
+            <w:tcW w:type="dxa" w:w="2340"/>
+          </w:tcPr>
+          <w:p>
+            <w:r>
+              <w:t>Xem thời khóa biểu</w:t>
+            </w:r>
+          </w:p>
+        </w:tc>
+        <w:tc>
+          <w:tcPr>
+            <w:tcW w:type="dxa" w:w="2340"/>
+          </w:tcPr>
+          <w:p>
+            <w:r>
+              <w:t>Sinh viên đã đăng ký 4 môn học</w:t>
+            </w:r>
+          </w:p>
+        </w:tc>
+        <w:tc>
+          <w:tcPr>
+            <w:tcW w:type="dxa" w:w="2340"/>
+          </w:tcPr>
+          <w:p>
+            <w:r>
+              <w:t>Hiển thị đầy đủ lịch học theo thứ, tiết, phòng</w:t>
+            </w:r>
+          </w:p>
+        </w:tc>
+        <w:tc>
+          <w:tcPr>
+            <w:tcW w:type="dxa" w:w="2340"/>
+          </w:tcPr>
+          <w:p>
+            <w:r>
+              <w:t>Pass</w:t>
+            </w:r>
+          </w:p>
+        </w:tc>
+      </w:tr>
+      <w:tr>
+        <w:tc>
+          <w:tcPr>
+            <w:tcW w:type="dxa" w:w="2340"/>
+          </w:tcPr>
+          <w:p>
+            <w:r>
+              <w:t>Xem lịch thi</w:t>
+            </w:r>
+          </w:p>
+        </w:tc>
+        <w:tc>
+          <w:tcPr>
+            <w:tcW w:type="dxa" w:w="2340"/>
+          </w:tcPr>
+          <w:p>
+            <w:r>
+              <w:t>Sinh viên đăng ký môn có lịch thi</w:t>
+            </w:r>
+          </w:p>
+        </w:tc>
+        <w:tc>
+          <w:tcPr>
+            <w:tcW w:type="dxa" w:w="2340"/>
+          </w:tcPr>
+          <w:p>
+            <w:r>
+              <w:t>Hiển thị ngày thi, ca thi, phòng thi tương ứng</w:t>
+            </w:r>
+          </w:p>
+        </w:tc>
+        <w:tc>
+          <w:tcPr>
+            <w:tcW w:type="dxa" w:w="2340"/>
+          </w:tcPr>
+          <w:p>
+            <w:r>
+              <w:t>Pass</w:t>
+            </w:r>
+          </w:p>
+        </w:tc>
+      </w:tr>
+      <w:tr>
+        <w:tc>
+          <w:tcPr>
+            <w:tcW w:type="dxa" w:w="2340"/>
+          </w:tcPr>
+          <w:p>
+            <w:r>
+              <w:t>Xem lịch thi (chưa có)</w:t>
+            </w:r>
+          </w:p>
+        </w:tc>
+        <w:tc>
+          <w:tcPr>
+            <w:tcW w:type="dxa" w:w="2340"/>
+          </w:tcPr>
+          <w:p>
+            <w:r>
+              <w:t>Sinh viên đăng ký môn chưa có lịch thi</w:t>
+            </w:r>
+          </w:p>
+        </w:tc>
+        <w:tc>
+          <w:tcPr>
+            <w:tcW w:type="dxa" w:w="2340"/>
+          </w:tcPr>
+          <w:p>
+            <w:r>
+              <w:t>Hiển thị "Chưa có lịch" tại các cột ngày/ca/phòng thi</w:t>
+            </w:r>
+          </w:p>
+        </w:tc>
+        <w:tc>
+          <w:tcPr>
+            <w:tcW w:type="dxa" w:w="2340"/>
+          </w:tcPr>
+          <w:p>
+            <w:r>
+              <w:t>Pass</w:t>
+            </w:r>
+          </w:p>
+        </w:tc>
+      </w:tr>
+      <w:tr>
+        <w:tc>
+          <w:tcPr>
+            <w:tcW w:type="dxa" w:w="2340"/>
+          </w:tcPr>
+          <w:p>
+            <w:r>
+              <w:t>Đóng học phí đủ</w:t>
+            </w:r>
+          </w:p>
+        </w:tc>
+        <w:tc>
+          <w:tcPr>
+            <w:tcW w:type="dxa" w:w="2340"/>
+          </w:tcPr>
+          <w:p>
+            <w:r>
+              <w:t>Nhập số tiền bằng đúng công nợ còn lại</w:t>
+            </w:r>
+          </w:p>
+        </w:tc>
+        <w:tc>
+          <w:tcPr>
+            <w:tcW w:type="dxa" w:w="2340"/>
+          </w:tcPr>
+          <w:p>
+            <w:r>
+              <w:t>Trạng thái chuyển thành "Đã nộp", công nợ về 0</w:t>
+            </w:r>
+          </w:p>
+        </w:tc>
+        <w:tc>
+          <w:tcPr>
+            <w:tcW w:type="dxa" w:w="2340"/>
+          </w:tcPr>
+          <w:p>
+            <w:r>
+              <w:t>Pass</w:t>
+            </w:r>
+          </w:p>
+        </w:tc>
+      </w:tr>
+      <w:tr>
+        <w:tc>
+          <w:tcPr>
+            <w:tcW w:type="dxa" w:w="2340"/>
+          </w:tcPr>
+          <w:p>
+            <w:r>
+              <w:t>Đóng học phí một phần</w:t>
+            </w:r>
+          </w:p>
+        </w:tc>
+        <w:tc>
+          <w:tcPr>
+            <w:tcW w:type="dxa" w:w="2340"/>
+          </w:tcPr>
+          <w:p>
+            <w:r>
+              <w:t>Nhập số tiền nhỏ hơn công nợ</w:t>
+            </w:r>
+          </w:p>
+        </w:tc>
+        <w:tc>
+          <w:tcPr>
+            <w:tcW w:type="dxa" w:w="2340"/>
+          </w:tcPr>
+          <w:p>
+            <w:r>
+              <w:t>Trạng thái "Đã nộp một phần", số tiền đã nộp tăng</w:t>
+            </w:r>
+          </w:p>
+        </w:tc>
+        <w:tc>
+          <w:tcPr>
+            <w:tcW w:type="dxa" w:w="2340"/>
+          </w:tcPr>
+          <w:p>
+            <w:r>
+              <w:t>Pass</w:t>
+            </w:r>
+          </w:p>
+        </w:tc>
+      </w:tr>
+      <w:tr>
+        <w:tc>
+          <w:tcPr>
+            <w:tcW w:type="dxa" w:w="2340"/>
+          </w:tcPr>
+          <w:p>
+            <w:r>
+              <w:t>Đóng học phí khi đã hoàn thành</w:t>
+            </w:r>
+          </w:p>
+        </w:tc>
+        <w:tc>
+          <w:tcPr>
+            <w:tcW w:type="dxa" w:w="2340"/>
+          </w:tcPr>
+          <w:p>
+            <w:r>
+              <w:t>Sinh viên đã nộp đủ, thử đóng thêm</w:t>
+            </w:r>
+          </w:p>
+        </w:tc>
+        <w:tc>
+          <w:tcPr>
+            <w:tcW w:type="dxa" w:w="2340"/>
+          </w:tcPr>
+          <w:p>
+            <w:r>
+              <w:t>Hiển thị "Sinh viên đã hoàn thành học phí!"</w:t>
+            </w:r>
+          </w:p>
+        </w:tc>
+        <w:tc>
+          <w:tcPr>
+            <w:tcW w:type="dxa" w:w="2340"/>
+          </w:tcPr>
+          <w:p>
+            <w:r>
+              <w:t>Pass</w:t>
+            </w:r>
+          </w:p>
+        </w:tc>
+      </w:tr>
+      <w:tr>
+        <w:tc>
+          <w:tcPr>
+            <w:tcW w:type="dxa" w:w="2340"/>
+          </w:tcPr>
+          <w:p>
+            <w:r>
+              <w:t>Đổi thông tin cá nhân</w:t>
+            </w:r>
+          </w:p>
+        </w:tc>
+        <w:tc>
+          <w:tcPr>
+            <w:tcW w:type="dxa" w:w="2340"/>
+          </w:tcPr>
+          <w:p>
+            <w:r>
+              <w:t>Cập nhật họ tên và nơi sinh mới</w:t>
+            </w:r>
+          </w:p>
+        </w:tc>
+        <w:tc>
+          <w:tcPr>
+            <w:tcW w:type="dxa" w:w="2340"/>
+          </w:tcPr>
+          <w:p>
+            <w:r>
+              <w:t>Lưu thành công, thông tin hiển thị đúng giá trị mới</w:t>
+            </w:r>
+          </w:p>
+        </w:tc>
+        <w:tc>
+          <w:tcPr>
+            <w:tcW w:type="dxa" w:w="2340"/>
+          </w:tcPr>
+          <w:p>
+            <w:r>
+              <w:t>Pass</w:t>
+            </w:r>
+          </w:p>
+        </w:tc>
+      </w:tr>
+      <w:tr>
+        <w:tc>
+          <w:tcPr>
+            <w:tcW w:type="dxa" w:w="2340"/>
+          </w:tcPr>
+          <w:p>
+            <w:r>
+              <w:t>Hủy đăng ký môn (hợp lệ)</w:t>
+            </w:r>
+          </w:p>
+        </w:tc>
+        <w:tc>
+          <w:tcPr>
+            <w:tcW w:type="dxa" w:w="2340"/>
+          </w:tcPr>
+          <w:p>
+            <w:r>
+              <w:t>Bỏ chọn 1 môn, giữ ≥ 4 môn</w:t>
+            </w:r>
+          </w:p>
+        </w:tc>
+        <w:tc>
+          <w:tcPr>
+            <w:tcW w:type="dxa" w:w="2340"/>
+          </w:tcPr>
+          <w:p>
+            <w:r>
+              <w:t>Hủy thành công, học phí giảm tương ứng</w:t>
+            </w:r>
+          </w:p>
+        </w:tc>
+        <w:tc>
+          <w:tcPr>
+            <w:tcW w:type="dxa" w:w="2340"/>
+          </w:tcPr>
+          <w:p>
+            <w:r>
+              <w:t>Pass</w:t>
+            </w:r>
+          </w:p>
+        </w:tc>
+      </w:tr>
+      <w:tr>
+        <w:tc>
+          <w:tcPr>
+            <w:tcW w:type="dxa" w:w="2340"/>
+          </w:tcPr>
+          <w:p>
+            <w:r>
+              <w:t>Hủy đăng ký môn (không hợp lệ)</w:t>
+            </w:r>
+          </w:p>
+        </w:tc>
+        <w:tc>
+          <w:tcPr>
+            <w:tcW w:type="dxa" w:w="2340"/>
+          </w:tcPr>
+          <w:p>
+            <w:r>
+              <w:t>Bỏ chọn cho đến khi còn dưới 4 môn</w:t>
+            </w:r>
+          </w:p>
+        </w:tc>
+        <w:tc>
+          <w:tcPr>
+            <w:tcW w:type="dxa" w:w="2340"/>
+          </w:tcPr>
+          <w:p>
+            <w:r>
+              <w:t>Báo lỗi "Bạn phải chọn tối thiểu 4 môn học!"</w:t>
+            </w:r>
+          </w:p>
+        </w:tc>
+        <w:tc>
+          <w:tcPr>
+            <w:tcW w:type="dxa" w:w="2340"/>
+          </w:tcPr>
+          <w:p>
+            <w:r>
+              <w:t>Pass</w:t>
+            </w:r>
+          </w:p>
+        </w:tc>
+      </w:tr>
+      <w:tr>
+        <w:tc>
+          <w:tcPr>
+            <w:tcW w:type="dxa" w:w="2340"/>
+          </w:tcPr>
+          <w:p>
+            <w:r>
+              <w:t>Đăng xuất</w:t>
+            </w:r>
+          </w:p>
+        </w:tc>
+        <w:tc>
+          <w:tcPr>
+            <w:tcW w:type="dxa" w:w="2340"/>
+          </w:tcPr>
+          <w:p>
+            <w:r>
+              <w:t>Nhấn nút Đăng xuất</w:t>
+            </w:r>
+          </w:p>
+        </w:tc>
+        <w:tc>
+          <w:tcPr>
+            <w:tcW w:type="dxa" w:w="2340"/>
+          </w:tcPr>
+          <w:p>
+            <w:r>
+              <w:t>Xóa phiên đăng nhập, chuyển về trang login.html</w:t>
+            </w:r>
+          </w:p>
+        </w:tc>
+        <w:tc>
+          <w:tcPr>
+            <w:tcW w:type="dxa" w:w="2340"/>
+          </w:tcPr>
+          <w:p>
+            <w:r>
+              <w:t>Pass</w:t>
+            </w:r>
+          </w:p>
+        </w:tc>
+      </w:tr>
+    </w:tbl>
+    <w:p>
       <w:pPr>
         <w:pStyle w:val="u1"/>
         <w:spacing w:before="360" w:after="120"/>
@@ -2685,6 +3983,47 @@
       </w:pPr>
       <w:r>
         <w:t>Hạn chế hiện tại là phần nộp học phí mới chỉ ở mức mô phỏng (ví ảo), chưa liên kết ngân hàng thật. Hướng phát triển tiếp theo là tích hợp cổng thanh toán thực tế VNPAY và bổ sung tính năng kiểm tra điều kiện môn học tiên quyết.</w:t>
+      </w:r>
+    </w:p>
+    <w:p>
+      <w:pPr/>
+    </w:p>
+    <w:p>
+      <w:pPr/>
+      <w:r>
+        <w:t>Ngoài ra, nhóm đề xuất các hướng phát triển mở rộng sau:</w:t>
+      </w:r>
+    </w:p>
+    <w:p>
+      <w:pPr>
+        <w:pStyle w:val="Duudong"/>
+      </w:pPr>
+      <w:r>
+        <w:t>Bổ sung tính năng xem toàn bộ chương trình đào tạo theo ngành, giúp sinh viên nắm rõ lộ trình học tập và số tín chỉ tích lũy cần thiết để tốt nghiệp.</w:t>
+      </w:r>
+    </w:p>
+    <w:p>
+      <w:pPr>
+        <w:pStyle w:val="Duudong"/>
+      </w:pPr>
+      <w:r>
+        <w:t>Xây dựng module lịch sử thanh toán học phí, cho phép sinh viên tra cứu lại toàn bộ các lần nộp tiền (ngày nộp, số tiền, phương thức thanh toán).</w:t>
+      </w:r>
+    </w:p>
+    <w:p>
+      <w:pPr>
+        <w:pStyle w:val="Duudong"/>
+      </w:pPr>
+      <w:r>
+        <w:t>Phát triển hệ thống thông báo nội bộ (Notifications), cho phép nhà trường gửi thông báo đến sinh viên về lịch đăng ký, thay đổi lịch thi, nhắc nhở đóng học phí.</w:t>
+      </w:r>
+    </w:p>
+    <w:p>
+      <w:pPr>
+        <w:pStyle w:val="Duudong"/>
+      </w:pPr>
+      <w:r>
+        <w:t>Bổ sung phân quyền cho tác nhân Admin và Giảng viên, bao gồm các chức năng: quản lý danh sách sinh viên, mở/đóng lớp học phần, và nhập điểm trực tiếp trên hệ thống.</w:t>
       </w:r>
     </w:p>
     <w:sectPr>

</xml_diff>